<commit_message>
Consolidate legacy OCI resource and registry helpers
</commit_message>
<xml_diff>
--- a/ags_docs/Aegis_OCI_Kubernetes_Deployment_Guide.docx
+++ b/ags_docs/Aegis_OCI_Kubernetes_Deployment_Guide.docx
@@ -1626,7 +1626,7 @@
         <w:widowControl/>
       </w:pPr>
       <w:r>
-        <w:t>The historical ags_render.py also fixes namespace/storage conventions and restricts its generated hostname pattern. ags_provision.py and ags_registry.py contain pilot-specific state and identity assumptions. A new-tenancy installation needs reviewed destination-specific setup before the code release path can be used; these helpers are not a turnkey installer.</w:t>
+        <w:t>The historical ags_render.py also fixes namespace/storage conventions and restricts its generated hostname pattern. The old infrastructure and registry helpers are retained together in ags_legacy_provisioning.py. They keep the pilot-specific settings and private-state requirements. A new-tenancy installation needs reviewed destination-specific setup before the code release path can be used; the legacy helper is not a turnkey installer.</w:t>
       </w:r>
     </w:p>
     <w:p>
@@ -2685,7 +2685,7 @@
         <w:widowControl/>
       </w:pPr>
       <w:r>
-        <w:t>Repository evidence: deploy-aegis-code.ps1, both Dockerfiles, ags_oke/ags_render.py and ags_runtime_config.py were inspected at source revision 387bd47. The generic Kubernetes base was also inspected to distinguish its topology. The commands in this guide were parsed without executing a rollout. No new cluster or restored workspace was tested for this documentation.</w:t>
+        <w:t>Repository evidence: the release script, Dockerfiles, renderer and runtime configuration were inspected at revision 387bd47. The pilot infrastructure and registry helpers are now consolidated in ags_oke/ags_legacy_provisioning.py. Normal image releases use deploy-aegis-code.ps1; existing kubeconfig authentication still uses ags_kubeconfig.py. Consolidation checks did not execute OCI operations.</w:t>
       </w:r>
     </w:p>
     <w:p>

</xml_diff>

<commit_message>
Prepare guarded Oracle schema installation for new OCI databases
</commit_message>
<xml_diff>
--- a/ags_docs/Aegis_OCI_Kubernetes_Deployment_Guide.docx
+++ b/ags_docs/Aegis_OCI_Kubernetes_Deployment_Guide.docx
@@ -604,16 +604,8 @@
             </w:tcBorders>
           </w:tcPr>
           <w:p>
-            <w:pPr>
-              <w:spacing w:after="0" w:line="245" w:lineRule="auto"/>
-            </w:pPr>
             <w:r>
-              <w:rPr>
-                <w:b w:val="0"/>
-                <w:color w:val="000000"/>
-                <w:sz w:val="20"/>
-              </w:rPr>
-              <w:t>Destination Oracle Autonomous AI Database supporting the application schema and native VECTOR search; service alias, account and wallet when required.</w:t>
+              <w:t>Destination Autonomous AI Database 26ai; separate empty owner with CREATE SESSION and CREATE TABLE, DATA quota, SQL BOOLEAN, native VECTOR and data-bound collations. Use the guarded installer in ags_database.</w:t>
             </w:r>
           </w:p>
         </w:tc>
@@ -1626,7 +1618,7 @@
         <w:widowControl/>
       </w:pPr>
       <w:r>
-        <w:t>The historical ags_render.py also fixes namespace/storage conventions and restricts its generated hostname pattern. The old infrastructure and registry helpers are retained together in ags_legacy_provisioning.py. They keep the pilot-specific settings and private-state requirements. A new-tenancy installation needs reviewed destination-specific setup before the code release path can be used; the legacy helper is not a turnkey installer.</w:t>
+        <w:t>For a fresh destination database, follow ags_database/README.md. Start SQLcl in ags_database and run @install.sql EXPECTED_OWNER EXPECTED_FULL_SERVICE_NAME after connecting with the destination wallet. The installer checks the owner, full server service, empty schema, privileges, quota and Oracle features, then verifies all thirteen tables. It creates schema only; it does not transfer existing users or data. The legacy OCI renderer and provisioning helper still require reviewed destination-specific setup.</w:t>
       </w:r>
     </w:p>
     <w:p>

</xml_diff>

<commit_message>
Refresh backend and OCI guides for the verified live dependency profile
</commit_message>
<xml_diff>
--- a/ags_docs/Aegis_OCI_Kubernetes_Deployment_Guide.docx
+++ b/ags_docs/Aegis_OCI_Kubernetes_Deployment_Guide.docx
@@ -15,7 +15,7 @@
         <w:widowControl/>
       </w:pPr>
       <w:r>
-        <w:t>Operator guide prepared on 15 October 2026 for branch ags_sprint1. Use this document to prepare an OCI Kubernetes Engine destination, publish Aegis application images and verify the release. The separate architecture handover describes the deployed system and its verified resource snapshot.</w:t>
+        <w:t>Operator guide updated on 16 October 2026 for branch ags_sprint1. Use this document to prepare an OCI Kubernetes Engine destination, publish Aegis application images and verify the release. The separate architecture handover describes the deployed system and its verified resource snapshot.</w:t>
       </w:r>
     </w:p>
     <w:p>
@@ -1794,7 +1794,7 @@
         <w:widowControl/>
       </w:pPr>
       <w:r>
-        <w:t>The script builds the backend with INSTALL_ORACLE=true and INSTALL_OCI=true, and INSTALL_CLOUD_MODELS=false plus INSTALL_LOCAL_EMBEDDINGS=false. Gemini uses the existing HTTP-compatible transport. A provider needing an optional native SDK or local sentence-transformers needs an explicitly verified image with those dependencies.</w:t>
+        <w:t>The script builds the backend with INSTALL_ORACLE=true, INSTALL_OCI=true and INSTALL_CLOUD_MODELS=true, retaining the live Oracle, AWS and Google SDKs at pinned versions. INSTALL_LOCAL_EMBEDDINGS=false matches live. Existing Ollama/Gemini endpoints, model registrations and configuration are preserved; model weights are not installed by the release.</w:t>
       </w:r>
     </w:p>
     <w:p>
@@ -2677,7 +2677,7 @@
         <w:widowControl/>
       </w:pPr>
       <w:r>
-        <w:t>Repository evidence: the release script, Dockerfiles, renderer and runtime configuration were inspected at revision 387bd47. The pilot infrastructure and registry helpers are now consolidated in ags_oke/ags_legacy_provisioning.py. Normal image releases use deploy-aegis-code.ps1; existing kubeconfig authentication still uses ags_kubeconfig.py. Consolidation checks did not execute OCI operations.</w:t>
+        <w:t>Repository evidence: the release script, Dockerfiles, renderer and runtime configuration were inspected at revision a7a02dd. The pilot infrastructure and registry helpers are now consolidated in ags_oke/ags_legacy_provisioning.py. Normal image releases use deploy-aegis-code.ps1; existing kubeconfig authentication still uses ags_kubeconfig.py. Consolidation checks did not execute OCI operations.</w:t>
       </w:r>
     </w:p>
     <w:p>

</xml_diff>